<commit_message>
Update clients/yuma_pet/KP_YUMA_PET.docx — unique company content
</commit_message>
<xml_diff>
--- a/clients/yuma_pet/KP_YUMA_PET.docx
+++ b/clients/yuma_pet/KP_YUMA_PET.docx
@@ -630,9 +630,7 @@
             <w:tcW w:type="dxa" w:w="5102"/>
           </w:tcPr>
           <w:p>
-            <w:r>
-              <w:t>11.03.2015</w:t>
-            </w:r>
+            <w:r/>
           </w:p>
         </w:tc>
       </w:tr>
@@ -765,7 +763,7 @@
           </w:tcPr>
           <w:p>
             <w:r>
-              <w:t>~406 млн ₽</w:t>
+              <w:t>2025 — 406 млн руб. (+9,3% к 2024)</w:t>
             </w:r>
           </w:p>
         </w:tc>
@@ -865,7 +863,7 @@
           </w:tcPr>
           <w:p>
             <w:r>
-              <w:t>~10 млн ₽</w:t>
+              <w:t>~10 млн руб.</w:t>
             </w:r>
           </w:p>
         </w:tc>
@@ -898,7 +896,7 @@
           </w:tcPr>
           <w:p>
             <w:r>
-              <w:t>~100 млн ₽</w:t>
+              <w:t>~100 млн руб.</w:t>
             </w:r>
           </w:p>
         </w:tc>

</xml_diff>

<commit_message>
Update clients/yuma_pet/KP_YUMA_PET.docx — proper formatting
</commit_message>
<xml_diff>
--- a/clients/yuma_pet/KP_YUMA_PET.docx
+++ b/clients/yuma_pet/KP_YUMA_PET.docx
@@ -630,7 +630,9 @@
             <w:tcW w:type="dxa" w:w="5102"/>
           </w:tcPr>
           <w:p>
-            <w:r/>
+            <w:r>
+              <w:t>11.03.2015</w:t>
+            </w:r>
           </w:p>
         </w:tc>
       </w:tr>
@@ -763,7 +765,7 @@
           </w:tcPr>
           <w:p>
             <w:r>
-              <w:t>2025 — 406 млн руб. (+9,3% к 2024)</w:t>
+              <w:t>406 млн руб. (2025)</w:t>
             </w:r>
           </w:p>
         </w:tc>
@@ -862,8 +864,19 @@
             <w:tcW w:type="dxa" w:w="3969"/>
           </w:tcPr>
           <w:p>
+            <w:pPr>
+              <w:spacing w:before="60" w:after="60"/>
+              <w:jc w:val="right"/>
+            </w:pPr>
+            <w:r/>
             <w:r>
-              <w:t>~10 млн руб.</w:t>
+              <w:rPr>
+                <w:rFonts w:ascii="Calibri" w:hAnsi="Calibri"/>
+                <w:b/>
+                <w:color w:val="2563EB"/>
+                <w:sz w:val="19"/>
+              </w:rPr>
+              <w:t>406 млн руб. (2025) млн ₽</w:t>
             </w:r>
           </w:p>
         </w:tc>
@@ -895,8 +908,19 @@
             <w:shd w:fill="fafafa" w:val="clear"/>
           </w:tcPr>
           <w:p>
+            <w:pPr>
+              <w:spacing w:before="60" w:after="60"/>
+              <w:jc w:val="right"/>
+            </w:pPr>
+            <w:r/>
             <w:r>
-              <w:t>~100 млн руб.</w:t>
+              <w:rPr>
+                <w:rFonts w:ascii="Calibri" w:hAnsi="Calibri"/>
+                <w:b/>
+                <w:color w:val="DC2626"/>
+                <w:sz w:val="19"/>
+              </w:rPr>
+              <w:t>406 млн руб. (2025) млн ₽</w:t>
             </w:r>
           </w:p>
         </w:tc>

</xml_diff>